<commit_message>
menghilangkan stabilo kuning di SPK
</commit_message>
<xml_diff>
--- a/public/SPK.docx
+++ b/public/SPK.docx
@@ -95,7 +95,6 @@
           <w:color w:val="000000" w:themeColor="text1"/>
           <w:sz w:val="24"/>
           <w:szCs w:val="24"/>
-          <w:highlight w:val="yellow"/>
           <w:lang w:val="sv-SE"/>
         </w:rPr>
         <w:t>${BULAN}</w:t>
@@ -220,22 +219,9 @@
           <w:color w:val="000000" w:themeColor="text1"/>
           <w:sz w:val="24"/>
           <w:szCs w:val="24"/>
-          <w:highlight w:val="yellow"/>
-          <w:lang w:val="sv-SE"/>
-        </w:rPr>
-        <w:t>${nomor}</w:t>
-      </w:r>
-      <w:r>
-        <w:rPr>
-          <w:rFonts w:ascii="Bookman Old Style" w:hAnsi="Bookman Old Style"/>
-          <w:b/>
-          <w:noProof/>
-          <w:color w:val="000000" w:themeColor="text1"/>
-          <w:sz w:val="24"/>
-          <w:szCs w:val="24"/>
-          <w:lang w:val="sv-SE"/>
-        </w:rPr>
-        <w:t xml:space="preserve"> TAHUN </w:t>
+          <w:lang w:val="sv-SE"/>
+        </w:rPr>
+        <w:t xml:space="preserve">${nomor} TAHUN </w:t>
       </w:r>
       <w:r>
         <w:rPr>
@@ -318,7 +304,6 @@
           <w:color w:val="000000" w:themeColor="text1"/>
           <w:sz w:val="24"/>
           <w:szCs w:val="24"/>
-          <w:highlight w:val="yellow"/>
           <w:lang w:val="sv-SE"/>
         </w:rPr>
         <w:t>${hari}</w:t>
@@ -340,7 +325,6 @@
           <w:color w:val="000000" w:themeColor="text1"/>
           <w:sz w:val="24"/>
           <w:szCs w:val="24"/>
-          <w:highlight w:val="yellow"/>
           <w:lang w:val="sv-SE"/>
         </w:rPr>
         <w:t>${tanggal}</w:t>
@@ -362,7 +346,6 @@
           <w:color w:val="000000" w:themeColor="text1"/>
           <w:sz w:val="24"/>
           <w:szCs w:val="24"/>
-          <w:highlight w:val="yellow"/>
           <w:lang w:val="sv-SE"/>
         </w:rPr>
         <w:t>${</w:t>
@@ -374,7 +357,6 @@
           <w:color w:val="000000" w:themeColor="text1"/>
           <w:sz w:val="24"/>
           <w:szCs w:val="24"/>
-          <w:highlight w:val="yellow"/>
           <w:lang w:val="sv-SE"/>
         </w:rPr>
         <w:t>b</w:t>
@@ -386,7 +368,6 @@
           <w:color w:val="000000" w:themeColor="text1"/>
           <w:sz w:val="24"/>
           <w:szCs w:val="24"/>
-          <w:highlight w:val="yellow"/>
           <w:lang w:val="sv-SE"/>
         </w:rPr>
         <w:t>ulan}</w:t>
@@ -630,7 +611,6 @@
           <w:color w:val="000000" w:themeColor="text1"/>
           <w:sz w:val="24"/>
           <w:szCs w:val="24"/>
-          <w:highlight w:val="yellow"/>
           <w:lang w:val="sv-SE"/>
         </w:rPr>
         <w:t>${nama_mitra}</w:t>
@@ -664,7 +644,6 @@
           <w:color w:val="000000" w:themeColor="text1"/>
           <w:sz w:val="24"/>
           <w:szCs w:val="24"/>
-          <w:highlight w:val="yellow"/>
           <w:lang w:val="sv-SE"/>
         </w:rPr>
         <w:t>${kec_asal}</w:t>
@@ -806,7 +785,6 @@
           <w:color w:val="000000" w:themeColor="text1"/>
           <w:sz w:val="24"/>
           <w:szCs w:val="24"/>
-          <w:highlight w:val="yellow"/>
           <w:lang w:val="sv-SE"/>
         </w:rPr>
         <w:t xml:space="preserve">Petugas </w:t>
@@ -818,7 +796,6 @@
           <w:color w:val="000000" w:themeColor="text1"/>
           <w:sz w:val="24"/>
           <w:szCs w:val="24"/>
-          <w:highlight w:val="yellow"/>
           <w:lang w:val="sv-SE"/>
         </w:rPr>
         <w:t>Pengawasan/Petugas Pencacahan</w:t>
@@ -830,7 +807,6 @@
           <w:color w:val="000000" w:themeColor="text1"/>
           <w:sz w:val="24"/>
           <w:szCs w:val="24"/>
-          <w:highlight w:val="yellow"/>
           <w:lang w:val="sv-SE"/>
         </w:rPr>
         <w:t>/Petugas Pengolahan</w:t>
@@ -842,7 +818,6 @@
           <w:color w:val="000000" w:themeColor="text1"/>
           <w:sz w:val="24"/>
           <w:szCs w:val="24"/>
-          <w:highlight w:val="yellow"/>
           <w:lang w:val="sv-SE"/>
         </w:rPr>
         <w:t xml:space="preserve"> kegiatan Lapangan Survei</w:t>
@@ -879,7 +854,6 @@
           <w:color w:val="000000" w:themeColor="text1"/>
           <w:sz w:val="24"/>
           <w:szCs w:val="24"/>
-          <w:highlight w:val="yellow"/>
           <w:lang w:val="sv-SE"/>
         </w:rPr>
         <w:t>${</w:t>
@@ -892,7 +866,6 @@
           <w:color w:val="000000" w:themeColor="text1"/>
           <w:sz w:val="24"/>
           <w:szCs w:val="24"/>
-          <w:highlight w:val="yellow"/>
           <w:lang w:val="sv-SE"/>
         </w:rPr>
         <w:t>B</w:t>
@@ -905,10 +878,9 @@
           <w:color w:val="000000" w:themeColor="text1"/>
           <w:sz w:val="24"/>
           <w:szCs w:val="24"/>
-          <w:highlight w:val="yellow"/>
-          <w:lang w:val="sv-SE"/>
-        </w:rPr>
-        <w:t>ulan</w:t>
+          <w:lang w:val="sv-SE"/>
+        </w:rPr>
+        <w:t>ulan}</w:t>
       </w:r>
       <w:r>
         <w:rPr>
@@ -918,10 +890,211 @@
           <w:color w:val="000000" w:themeColor="text1"/>
           <w:sz w:val="24"/>
           <w:szCs w:val="24"/>
-          <w:highlight w:val="yellow"/>
-          <w:lang w:val="sv-SE"/>
-        </w:rPr>
-        <w:t>}</w:t>
+          <w:lang w:val="sv-SE"/>
+        </w:rPr>
+        <w:t xml:space="preserve"> </w:t>
+      </w:r>
+      <w:r>
+        <w:rPr>
+          <w:rFonts w:ascii="Bookman Old Style" w:hAnsi="Bookman Old Style"/>
+          <w:bCs/>
+          <w:color w:val="000000" w:themeColor="text1"/>
+          <w:sz w:val="24"/>
+          <w:szCs w:val="24"/>
+          <w:lang w:val="sv-SE"/>
+        </w:rPr>
+        <w:t>Tahun 202</w:t>
+      </w:r>
+      <w:r>
+        <w:rPr>
+          <w:rFonts w:ascii="Bookman Old Style" w:hAnsi="Bookman Old Style"/>
+          <w:bCs/>
+          <w:color w:val="000000" w:themeColor="text1"/>
+          <w:sz w:val="24"/>
+          <w:szCs w:val="24"/>
+          <w:lang w:val="sv-SE"/>
+        </w:rPr>
+        <w:t>5</w:t>
+      </w:r>
+      <w:r>
+        <w:rPr>
+          <w:rFonts w:ascii="Bookman Old Style" w:hAnsi="Bookman Old Style"/>
+          <w:bCs/>
+          <w:color w:val="000000" w:themeColor="text1"/>
+          <w:sz w:val="24"/>
+          <w:szCs w:val="24"/>
+          <w:lang w:val="sv-SE"/>
+        </w:rPr>
+        <w:t xml:space="preserve"> pada B</w:t>
+      </w:r>
+      <w:r>
+        <w:rPr>
+          <w:rFonts w:ascii="Bookman Old Style" w:hAnsi="Bookman Old Style"/>
+          <w:bCs/>
+          <w:color w:val="000000" w:themeColor="text1"/>
+          <w:sz w:val="24"/>
+          <w:szCs w:val="24"/>
+          <w:lang w:val="id-ID"/>
+        </w:rPr>
+        <w:t>adan Pusat Statistik</w:t>
+      </w:r>
+      <w:r>
+        <w:rPr>
+          <w:rFonts w:ascii="Bookman Old Style" w:hAnsi="Bookman Old Style"/>
+          <w:bCs/>
+          <w:color w:val="000000" w:themeColor="text1"/>
+          <w:sz w:val="24"/>
+          <w:szCs w:val="24"/>
+          <w:lang w:val="sv-SE"/>
+        </w:rPr>
+        <w:t xml:space="preserve"> Kabupaten Simeulue</w:t>
+      </w:r>
+      <w:r>
+        <w:rPr>
+          <w:rFonts w:ascii="Bookman Old Style" w:hAnsi="Bookman Old Style"/>
+          <w:color w:val="000000" w:themeColor="text1"/>
+          <w:sz w:val="24"/>
+          <w:szCs w:val="24"/>
+          <w:lang w:val="sv-SE"/>
+        </w:rPr>
+        <w:t>, yang selanjutnya disebut Perjanjian, dengan ketentuan-ketentuan sebagai berikut:</w:t>
+      </w:r>
+    </w:p>
+    <w:p>
+      <w:pPr>
+        <w:spacing w:line="276" w:lineRule="auto"/>
+        <w:jc w:val="both"/>
+        <w:rPr>
+          <w:rFonts w:ascii="Bookman Old Style" w:hAnsi="Bookman Old Style"/>
+          <w:bCs/>
+          <w:color w:val="000000" w:themeColor="text1"/>
+          <w:sz w:val="24"/>
+          <w:szCs w:val="24"/>
+          <w:lang w:val="sv-SE"/>
+        </w:rPr>
+      </w:pPr>
+    </w:p>
+    <w:p>
+      <w:pPr>
+        <w:spacing w:after="240" w:line="276" w:lineRule="auto"/>
+        <w:jc w:val="center"/>
+        <w:rPr>
+          <w:rFonts w:ascii="Bookman Old Style" w:hAnsi="Bookman Old Style"/>
+          <w:b/>
+          <w:color w:val="000000" w:themeColor="text1"/>
+          <w:sz w:val="24"/>
+          <w:szCs w:val="24"/>
+          <w:lang w:val="sv-SE"/>
+        </w:rPr>
+      </w:pPr>
+      <w:r>
+        <w:rPr>
+          <w:rFonts w:ascii="Bookman Old Style" w:hAnsi="Bookman Old Style"/>
+          <w:b/>
+          <w:color w:val="000000" w:themeColor="text1"/>
+          <w:sz w:val="24"/>
+          <w:szCs w:val="24"/>
+          <w:lang w:val="sv-SE"/>
+        </w:rPr>
+        <w:t>Pasal 1</w:t>
+      </w:r>
+    </w:p>
+    <w:p>
+      <w:pPr>
+        <w:spacing w:line="276" w:lineRule="auto"/>
+        <w:jc w:val="both"/>
+        <w:rPr>
+          <w:rFonts w:ascii="Bookman Old Style" w:hAnsi="Bookman Old Style"/>
+          <w:b/>
+          <w:color w:val="000000" w:themeColor="text1"/>
+          <w:sz w:val="24"/>
+          <w:szCs w:val="24"/>
+          <w:lang w:val="id-ID"/>
+        </w:rPr>
+      </w:pPr>
+      <w:r>
+        <w:rPr>
+          <w:rFonts w:ascii="Bookman Old Style" w:hAnsi="Bookman Old Style"/>
+          <w:b/>
+          <w:color w:val="000000" w:themeColor="text1"/>
+          <w:sz w:val="24"/>
+          <w:szCs w:val="24"/>
+          <w:lang w:val="sv-SE"/>
+        </w:rPr>
+        <w:t>PIHAK PERTAMA</w:t>
+      </w:r>
+      <w:r>
+        <w:rPr>
+          <w:rFonts w:ascii="Bookman Old Style" w:hAnsi="Bookman Old Style"/>
+          <w:color w:val="000000" w:themeColor="text1"/>
+          <w:sz w:val="24"/>
+          <w:szCs w:val="24"/>
+          <w:lang w:val="sv-SE"/>
+        </w:rPr>
+        <w:t xml:space="preserve"> memberikan pekerjaan kepada </w:t>
+      </w:r>
+      <w:r>
+        <w:rPr>
+          <w:rFonts w:ascii="Bookman Old Style" w:hAnsi="Bookman Old Style"/>
+          <w:b/>
+          <w:color w:val="000000" w:themeColor="text1"/>
+          <w:sz w:val="24"/>
+          <w:szCs w:val="24"/>
+          <w:lang w:val="sv-SE"/>
+        </w:rPr>
+        <w:t>PIHAK KEDUA</w:t>
+      </w:r>
+      <w:r>
+        <w:rPr>
+          <w:rFonts w:ascii="Bookman Old Style" w:hAnsi="Bookman Old Style"/>
+          <w:color w:val="000000" w:themeColor="text1"/>
+          <w:sz w:val="24"/>
+          <w:szCs w:val="24"/>
+          <w:lang w:val="sv-SE"/>
+        </w:rPr>
+        <w:t xml:space="preserve"> dan </w:t>
+      </w:r>
+      <w:r>
+        <w:rPr>
+          <w:rFonts w:ascii="Bookman Old Style" w:hAnsi="Bookman Old Style"/>
+          <w:b/>
+          <w:color w:val="000000" w:themeColor="text1"/>
+          <w:sz w:val="24"/>
+          <w:szCs w:val="24"/>
+          <w:lang w:val="sv-SE"/>
+        </w:rPr>
+        <w:t>PIHAK KEDUA</w:t>
+      </w:r>
+      <w:r>
+        <w:rPr>
+          <w:rFonts w:ascii="Bookman Old Style" w:hAnsi="Bookman Old Style"/>
+          <w:color w:val="000000" w:themeColor="text1"/>
+          <w:sz w:val="24"/>
+          <w:szCs w:val="24"/>
+          <w:lang w:val="sv-SE"/>
+        </w:rPr>
+        <w:t xml:space="preserve"> menerima pekerjaan dari </w:t>
+      </w:r>
+      <w:r>
+        <w:rPr>
+          <w:rFonts w:ascii="Bookman Old Style" w:hAnsi="Bookman Old Style"/>
+          <w:b/>
+          <w:color w:val="000000" w:themeColor="text1"/>
+          <w:sz w:val="24"/>
+          <w:szCs w:val="24"/>
+          <w:lang w:val="sv-SE"/>
+        </w:rPr>
+        <w:t>PIHAK PERTAMA</w:t>
+      </w:r>
+      <w:r>
+        <w:rPr>
+          <w:rFonts w:ascii="Bookman Old Style" w:hAnsi="Bookman Old Style"/>
+          <w:color w:val="000000" w:themeColor="text1"/>
+          <w:sz w:val="24"/>
+          <w:szCs w:val="24"/>
+          <w:lang w:val="sv-SE"/>
+        </w:rPr>
+        <w:t xml:space="preserve"> sebagai </w:t>
       </w:r>
       <w:r>
         <w:rPr>
@@ -933,12 +1106,95 @@
           <w:szCs w:val="24"/>
           <w:lang w:val="sv-SE"/>
         </w:rPr>
+        <w:t>Petugas</w:t>
+      </w:r>
+      <w:r>
+        <w:rPr>
+          <w:rFonts w:ascii="Bookman Old Style" w:hAnsi="Bookman Old Style"/>
+          <w:bCs/>
+          <w:noProof/>
+          <w:color w:val="000000" w:themeColor="text1"/>
+          <w:sz w:val="24"/>
+          <w:szCs w:val="24"/>
+          <w:lang w:val="sv-SE"/>
+        </w:rPr>
+        <w:t xml:space="preserve"> Pengawasan/Petugas </w:t>
+      </w:r>
+      <w:r>
+        <w:rPr>
+          <w:rFonts w:ascii="Bookman Old Style" w:hAnsi="Bookman Old Style"/>
+          <w:bCs/>
+          <w:noProof/>
+          <w:color w:val="000000" w:themeColor="text1"/>
+          <w:sz w:val="24"/>
+          <w:szCs w:val="24"/>
+          <w:lang w:val="sv-SE"/>
+        </w:rPr>
+        <w:t>Pencacahan Kegiatan Lapangan</w:t>
+      </w:r>
+      <w:r>
+        <w:rPr>
+          <w:rFonts w:ascii="Bookman Old Style" w:hAnsi="Bookman Old Style"/>
+          <w:bCs/>
+          <w:color w:val="000000" w:themeColor="text1"/>
+          <w:sz w:val="24"/>
+          <w:szCs w:val="24"/>
+          <w:lang w:val="sv-SE"/>
+        </w:rPr>
         <w:t xml:space="preserve"> </w:t>
       </w:r>
       <w:r>
         <w:rPr>
           <w:rFonts w:ascii="Bookman Old Style" w:hAnsi="Bookman Old Style"/>
           <w:bCs/>
+          <w:noProof/>
+          <w:color w:val="000000" w:themeColor="text1"/>
+          <w:sz w:val="24"/>
+          <w:szCs w:val="24"/>
+          <w:lang w:val="sv-SE"/>
+        </w:rPr>
+        <w:t>Survei</w:t>
+      </w:r>
+      <w:r>
+        <w:rPr>
+          <w:rFonts w:ascii="Bookman Old Style" w:hAnsi="Bookman Old Style"/>
+          <w:bCs/>
+          <w:noProof/>
+          <w:color w:val="000000" w:themeColor="text1"/>
+          <w:sz w:val="24"/>
+          <w:szCs w:val="24"/>
+          <w:lang w:val="sv-SE"/>
+        </w:rPr>
+        <w:t xml:space="preserve"> </w:t>
+      </w:r>
+      <w:r>
+        <w:rPr>
+          <w:rFonts w:ascii="Bookman Old Style" w:hAnsi="Bookman Old Style"/>
+          <w:bCs/>
+          <w:noProof/>
+          <w:color w:val="000000" w:themeColor="text1"/>
+          <w:sz w:val="24"/>
+          <w:szCs w:val="24"/>
+          <w:lang w:val="sv-SE"/>
+        </w:rPr>
+        <w:t xml:space="preserve">Bulan Februari </w:t>
+      </w:r>
+      <w:r>
+        <w:rPr>
+          <w:rFonts w:ascii="Bookman Old Style" w:hAnsi="Bookman Old Style"/>
+          <w:bCs/>
+          <w:noProof/>
+          <w:color w:val="000000" w:themeColor="text1"/>
+          <w:sz w:val="24"/>
+          <w:szCs w:val="24"/>
+          <w:lang w:val="sv-SE"/>
+        </w:rPr>
+        <w:t xml:space="preserve"> </w:t>
+      </w:r>
+      <w:r>
+        <w:rPr>
+          <w:rFonts w:ascii="Bookman Old Style" w:hAnsi="Bookman Old Style"/>
+          <w:bCs/>
           <w:color w:val="000000" w:themeColor="text1"/>
           <w:sz w:val="24"/>
           <w:szCs w:val="24"/>
@@ -988,17 +1244,48 @@
           <w:szCs w:val="24"/>
           <w:lang w:val="sv-SE"/>
         </w:rPr>
-        <w:t xml:space="preserve"> Kabupaten Simeulue</w:t>
-      </w:r>
-      <w:r>
-        <w:rPr>
-          <w:rFonts w:ascii="Bookman Old Style" w:hAnsi="Bookman Old Style"/>
-          <w:color w:val="000000" w:themeColor="text1"/>
-          <w:sz w:val="24"/>
-          <w:szCs w:val="24"/>
-          <w:lang w:val="sv-SE"/>
-        </w:rPr>
-        <w:t>, yang selanjutnya disebut Perjanjian, dengan ketentuan-ketentuan sebagai berikut:</w:t>
+        <w:t xml:space="preserve"> Kabupaten Simeulue,</w:t>
+      </w:r>
+      <w:r>
+        <w:rPr>
+          <w:rFonts w:ascii="Bookman Old Style" w:hAnsi="Bookman Old Style"/>
+          <w:color w:val="000000" w:themeColor="text1"/>
+          <w:sz w:val="24"/>
+          <w:szCs w:val="24"/>
+          <w:lang w:val="sv-SE"/>
+        </w:rPr>
+        <w:t xml:space="preserve"> dengan lingkup pekerjaan yang ditetapkan oleh </w:t>
+      </w:r>
+      <w:r>
+        <w:rPr>
+          <w:rFonts w:ascii="Bookman Old Style" w:hAnsi="Bookman Old Style"/>
+          <w:b/>
+          <w:color w:val="000000" w:themeColor="text1"/>
+          <w:sz w:val="24"/>
+          <w:szCs w:val="24"/>
+          <w:lang w:val="sv-SE"/>
+        </w:rPr>
+        <w:t>PIHAK PERTAMA</w:t>
+      </w:r>
+      <w:r>
+        <w:rPr>
+          <w:rFonts w:ascii="Bookman Old Style" w:hAnsi="Bookman Old Style"/>
+          <w:color w:val="000000" w:themeColor="text1"/>
+          <w:sz w:val="24"/>
+          <w:szCs w:val="24"/>
+          <w:lang w:val="sv-SE"/>
+        </w:rPr>
+        <w:t>.</w:t>
+      </w:r>
+      <w:r>
+        <w:rPr>
+          <w:rFonts w:ascii="Bookman Old Style" w:hAnsi="Bookman Old Style"/>
+          <w:color w:val="000000" w:themeColor="text1"/>
+          <w:sz w:val="24"/>
+          <w:szCs w:val="24"/>
+          <w:lang w:val="id-ID"/>
+        </w:rPr>
+        <w:t xml:space="preserve"> </w:t>
       </w:r>
     </w:p>
     <w:p>
@@ -1007,17 +1294,17 @@
         <w:jc w:val="both"/>
         <w:rPr>
           <w:rFonts w:ascii="Bookman Old Style" w:hAnsi="Bookman Old Style"/>
-          <w:bCs/>
-          <w:color w:val="000000" w:themeColor="text1"/>
-          <w:sz w:val="24"/>
-          <w:szCs w:val="24"/>
-          <w:lang w:val="sv-SE"/>
-        </w:rPr>
-      </w:pPr>
-    </w:p>
-    <w:p>
-      <w:pPr>
-        <w:spacing w:after="240" w:line="276" w:lineRule="auto"/>
+          <w:b/>
+          <w:color w:val="000000" w:themeColor="text1"/>
+          <w:sz w:val="24"/>
+          <w:szCs w:val="24"/>
+          <w:lang w:val="id-ID"/>
+        </w:rPr>
+      </w:pPr>
+    </w:p>
+    <w:p>
+      <w:pPr>
+        <w:spacing w:after="120"/>
         <w:jc w:val="center"/>
         <w:rPr>
           <w:rFonts w:ascii="Bookman Old Style" w:hAnsi="Bookman Old Style"/>
@@ -1025,19 +1312,19 @@
           <w:color w:val="000000" w:themeColor="text1"/>
           <w:sz w:val="24"/>
           <w:szCs w:val="24"/>
-          <w:lang w:val="sv-SE"/>
-        </w:rPr>
-      </w:pPr>
-      <w:r>
-        <w:rPr>
-          <w:rFonts w:ascii="Bookman Old Style" w:hAnsi="Bookman Old Style"/>
-          <w:b/>
-          <w:color w:val="000000" w:themeColor="text1"/>
-          <w:sz w:val="24"/>
-          <w:szCs w:val="24"/>
-          <w:lang w:val="sv-SE"/>
-        </w:rPr>
-        <w:t>Pasal 1</w:t>
+          <w:lang w:val="id-ID"/>
+        </w:rPr>
+      </w:pPr>
+      <w:r>
+        <w:rPr>
+          <w:rFonts w:ascii="Bookman Old Style" w:hAnsi="Bookman Old Style"/>
+          <w:b/>
+          <w:color w:val="000000" w:themeColor="text1"/>
+          <w:sz w:val="24"/>
+          <w:szCs w:val="24"/>
+          <w:lang w:val="id-ID"/>
+        </w:rPr>
+        <w:t>Pasal 2</w:t>
       </w:r>
     </w:p>
     <w:p>
@@ -1046,7 +1333,6 @@
         <w:jc w:val="both"/>
         <w:rPr>
           <w:rFonts w:ascii="Bookman Old Style" w:hAnsi="Bookman Old Style"/>
-          <w:b/>
           <w:color w:val="000000" w:themeColor="text1"/>
           <w:sz w:val="24"/>
           <w:szCs w:val="24"/>
@@ -1056,86 +1342,43 @@
       <w:r>
         <w:rPr>
           <w:rFonts w:ascii="Bookman Old Style" w:hAnsi="Bookman Old Style"/>
-          <w:b/>
-          <w:color w:val="000000" w:themeColor="text1"/>
-          <w:sz w:val="24"/>
-          <w:szCs w:val="24"/>
-          <w:lang w:val="sv-SE"/>
-        </w:rPr>
-        <w:t>PIHAK PERTAMA</w:t>
-      </w:r>
-      <w:r>
-        <w:rPr>
-          <w:rFonts w:ascii="Bookman Old Style" w:hAnsi="Bookman Old Style"/>
-          <w:color w:val="000000" w:themeColor="text1"/>
-          <w:sz w:val="24"/>
-          <w:szCs w:val="24"/>
-          <w:lang w:val="sv-SE"/>
-        </w:rPr>
-        <w:t xml:space="preserve"> memberikan pekerjaan kepada </w:t>
-      </w:r>
-      <w:r>
-        <w:rPr>
-          <w:rFonts w:ascii="Bookman Old Style" w:hAnsi="Bookman Old Style"/>
-          <w:b/>
-          <w:color w:val="000000" w:themeColor="text1"/>
-          <w:sz w:val="24"/>
-          <w:szCs w:val="24"/>
-          <w:lang w:val="sv-SE"/>
-        </w:rPr>
-        <w:t>PIHAK KEDUA</w:t>
-      </w:r>
-      <w:r>
-        <w:rPr>
-          <w:rFonts w:ascii="Bookman Old Style" w:hAnsi="Bookman Old Style"/>
-          <w:color w:val="000000" w:themeColor="text1"/>
-          <w:sz w:val="24"/>
-          <w:szCs w:val="24"/>
-          <w:lang w:val="sv-SE"/>
-        </w:rPr>
-        <w:t xml:space="preserve"> dan </w:t>
-      </w:r>
-      <w:r>
-        <w:rPr>
-          <w:rFonts w:ascii="Bookman Old Style" w:hAnsi="Bookman Old Style"/>
-          <w:b/>
-          <w:color w:val="000000" w:themeColor="text1"/>
-          <w:sz w:val="24"/>
-          <w:szCs w:val="24"/>
-          <w:lang w:val="sv-SE"/>
-        </w:rPr>
-        <w:t>PIHAK KEDUA</w:t>
-      </w:r>
-      <w:r>
-        <w:rPr>
-          <w:rFonts w:ascii="Bookman Old Style" w:hAnsi="Bookman Old Style"/>
-          <w:color w:val="000000" w:themeColor="text1"/>
-          <w:sz w:val="24"/>
-          <w:szCs w:val="24"/>
-          <w:lang w:val="sv-SE"/>
-        </w:rPr>
-        <w:t xml:space="preserve"> menerima pekerjaan dari </w:t>
-      </w:r>
-      <w:r>
-        <w:rPr>
-          <w:rFonts w:ascii="Bookman Old Style" w:hAnsi="Bookman Old Style"/>
-          <w:b/>
-          <w:color w:val="000000" w:themeColor="text1"/>
-          <w:sz w:val="24"/>
-          <w:szCs w:val="24"/>
-          <w:lang w:val="sv-SE"/>
-        </w:rPr>
-        <w:t>PIHAK PERTAMA</w:t>
-      </w:r>
-      <w:r>
-        <w:rPr>
-          <w:rFonts w:ascii="Bookman Old Style" w:hAnsi="Bookman Old Style"/>
-          <w:color w:val="000000" w:themeColor="text1"/>
-          <w:sz w:val="24"/>
-          <w:szCs w:val="24"/>
-          <w:lang w:val="sv-SE"/>
-        </w:rPr>
-        <w:t xml:space="preserve"> sebagai </w:t>
+          <w:color w:val="000000" w:themeColor="text1"/>
+          <w:sz w:val="24"/>
+          <w:szCs w:val="24"/>
+          <w:lang w:val="id-ID"/>
+        </w:rPr>
+        <w:t xml:space="preserve">Ruang lingkup pekerjaan dalam Perjanjian ini mengacu pada wilayah kerja dan beban kerja sebagaimana tertuang dalam lampiran Perjanjian. Pedoman </w:t>
+      </w:r>
+      <w:proofErr w:type="spellStart"/>
+      <w:r>
+        <w:rPr>
+          <w:rFonts w:ascii="Bookman Old Style" w:hAnsi="Bookman Old Style"/>
+          <w:color w:val="000000" w:themeColor="text1"/>
+          <w:sz w:val="24"/>
+          <w:szCs w:val="24"/>
+        </w:rPr>
+        <w:t>Pengawasan</w:t>
+      </w:r>
+      <w:proofErr w:type="spellEnd"/>
+      <w:r>
+        <w:rPr>
+          <w:rFonts w:ascii="Bookman Old Style" w:hAnsi="Bookman Old Style"/>
+          <w:color w:val="000000" w:themeColor="text1"/>
+          <w:sz w:val="24"/>
+          <w:szCs w:val="24"/>
+        </w:rPr>
+        <w:t>/</w:t>
+      </w:r>
+      <w:r>
+        <w:rPr>
+          <w:rFonts w:ascii="Bookman Old Style" w:hAnsi="Bookman Old Style"/>
+          <w:bCs/>
+          <w:color w:val="000000" w:themeColor="text1"/>
+          <w:sz w:val="24"/>
+          <w:szCs w:val="24"/>
+          <w:lang w:val="id-ID"/>
+        </w:rPr>
+        <w:t>Pen</w:t>
       </w:r>
       <w:r>
         <w:rPr>
@@ -1145,9 +1388,9 @@
           <w:color w:val="000000" w:themeColor="text1"/>
           <w:sz w:val="24"/>
           <w:szCs w:val="24"/>
-          <w:lang w:val="sv-SE"/>
-        </w:rPr>
-        <w:t>Petugas</w:t>
+          <w:lang w:val="id-ID"/>
+        </w:rPr>
+        <w:t>cacahan Kegiatan Lapangan Survei</w:t>
       </w:r>
       <w:r>
         <w:rPr>
@@ -1157,9 +1400,8 @@
           <w:color w:val="000000" w:themeColor="text1"/>
           <w:sz w:val="24"/>
           <w:szCs w:val="24"/>
-          <w:lang w:val="sv-SE"/>
-        </w:rPr>
-        <w:t xml:space="preserve"> Pengawasan/Petugas </w:t>
+        </w:rPr>
+        <w:t xml:space="preserve"> </w:t>
       </w:r>
       <w:r>
         <w:rPr>
@@ -1169,9 +1411,9 @@
           <w:color w:val="000000" w:themeColor="text1"/>
           <w:sz w:val="24"/>
           <w:szCs w:val="24"/>
-          <w:lang w:val="sv-SE"/>
-        </w:rPr>
-        <w:t>Pencacahan</w:t>
+          <w:lang w:val="id-ID"/>
+        </w:rPr>
+        <w:t xml:space="preserve">Bulan </w:t>
       </w:r>
       <w:r>
         <w:rPr>
@@ -1183,7 +1425,7 @@
           <w:szCs w:val="24"/>
           <w:lang w:val="sv-SE"/>
         </w:rPr>
-        <w:t xml:space="preserve"> Kegiatan Lapangan</w:t>
+        <w:t xml:space="preserve">${Bulan} </w:t>
       </w:r>
       <w:r>
         <w:rPr>
@@ -1192,143 +1434,30 @@
           <w:color w:val="000000" w:themeColor="text1"/>
           <w:sz w:val="24"/>
           <w:szCs w:val="24"/>
-          <w:lang w:val="sv-SE"/>
-        </w:rPr>
-        <w:t xml:space="preserve"> </w:t>
+          <w:lang w:val="id-ID"/>
+        </w:rPr>
+        <w:t>Tahun 202</w:t>
       </w:r>
       <w:r>
         <w:rPr>
           <w:rFonts w:ascii="Bookman Old Style" w:hAnsi="Bookman Old Style"/>
           <w:bCs/>
-          <w:noProof/>
-          <w:color w:val="000000" w:themeColor="text1"/>
-          <w:sz w:val="24"/>
-          <w:szCs w:val="24"/>
-          <w:lang w:val="sv-SE"/>
-        </w:rPr>
-        <w:t>Survei</w:t>
+          <w:color w:val="000000" w:themeColor="text1"/>
+          <w:sz w:val="24"/>
+          <w:szCs w:val="24"/>
+        </w:rPr>
+        <w:t>5</w:t>
       </w:r>
       <w:r>
         <w:rPr>
           <w:rFonts w:ascii="Bookman Old Style" w:hAnsi="Bookman Old Style"/>
           <w:bCs/>
-          <w:noProof/>
-          <w:color w:val="000000" w:themeColor="text1"/>
-          <w:sz w:val="24"/>
-          <w:szCs w:val="24"/>
-          <w:lang w:val="sv-SE"/>
-        </w:rPr>
-        <w:t xml:space="preserve"> </w:t>
-      </w:r>
-      <w:r>
-        <w:rPr>
-          <w:rFonts w:ascii="Bookman Old Style" w:hAnsi="Bookman Old Style"/>
-          <w:bCs/>
-          <w:noProof/>
-          <w:color w:val="000000" w:themeColor="text1"/>
-          <w:sz w:val="24"/>
-          <w:szCs w:val="24"/>
-          <w:lang w:val="sv-SE"/>
-        </w:rPr>
-        <w:t xml:space="preserve">Bulan Februari </w:t>
-      </w:r>
-      <w:r>
-        <w:rPr>
-          <w:rFonts w:ascii="Bookman Old Style" w:hAnsi="Bookman Old Style"/>
-          <w:bCs/>
-          <w:noProof/>
-          <w:color w:val="000000" w:themeColor="text1"/>
-          <w:sz w:val="24"/>
-          <w:szCs w:val="24"/>
-          <w:lang w:val="sv-SE"/>
-        </w:rPr>
-        <w:t xml:space="preserve"> </w:t>
-      </w:r>
-      <w:r>
-        <w:rPr>
-          <w:rFonts w:ascii="Bookman Old Style" w:hAnsi="Bookman Old Style"/>
-          <w:bCs/>
-          <w:color w:val="000000" w:themeColor="text1"/>
-          <w:sz w:val="24"/>
-          <w:szCs w:val="24"/>
-          <w:lang w:val="sv-SE"/>
-        </w:rPr>
-        <w:t>Tahun 202</w:t>
-      </w:r>
-      <w:r>
-        <w:rPr>
-          <w:rFonts w:ascii="Bookman Old Style" w:hAnsi="Bookman Old Style"/>
-          <w:bCs/>
-          <w:color w:val="000000" w:themeColor="text1"/>
-          <w:sz w:val="24"/>
-          <w:szCs w:val="24"/>
-          <w:lang w:val="sv-SE"/>
-        </w:rPr>
-        <w:t>5</w:t>
-      </w:r>
-      <w:r>
-        <w:rPr>
-          <w:rFonts w:ascii="Bookman Old Style" w:hAnsi="Bookman Old Style"/>
-          <w:bCs/>
-          <w:color w:val="000000" w:themeColor="text1"/>
-          <w:sz w:val="24"/>
-          <w:szCs w:val="24"/>
-          <w:lang w:val="sv-SE"/>
-        </w:rPr>
-        <w:t xml:space="preserve"> pada B</w:t>
-      </w:r>
-      <w:r>
-        <w:rPr>
-          <w:rFonts w:ascii="Bookman Old Style" w:hAnsi="Bookman Old Style"/>
-          <w:bCs/>
           <w:color w:val="000000" w:themeColor="text1"/>
           <w:sz w:val="24"/>
           <w:szCs w:val="24"/>
           <w:lang w:val="id-ID"/>
         </w:rPr>
-        <w:t>adan Pusat Statistik</w:t>
-      </w:r>
-      <w:r>
-        <w:rPr>
-          <w:rFonts w:ascii="Bookman Old Style" w:hAnsi="Bookman Old Style"/>
-          <w:bCs/>
-          <w:color w:val="000000" w:themeColor="text1"/>
-          <w:sz w:val="24"/>
-          <w:szCs w:val="24"/>
-          <w:lang w:val="sv-SE"/>
-        </w:rPr>
-        <w:t xml:space="preserve"> Kabupaten Simeulue,</w:t>
-      </w:r>
-      <w:r>
-        <w:rPr>
-          <w:rFonts w:ascii="Bookman Old Style" w:hAnsi="Bookman Old Style"/>
-          <w:color w:val="000000" w:themeColor="text1"/>
-          <w:sz w:val="24"/>
-          <w:szCs w:val="24"/>
-          <w:lang w:val="sv-SE"/>
-        </w:rPr>
-        <w:t xml:space="preserve"> dengan lingkup pekerjaan yang ditetapkan oleh </w:t>
-      </w:r>
-      <w:r>
-        <w:rPr>
-          <w:rFonts w:ascii="Bookman Old Style" w:hAnsi="Bookman Old Style"/>
-          <w:b/>
-          <w:color w:val="000000" w:themeColor="text1"/>
-          <w:sz w:val="24"/>
-          <w:szCs w:val="24"/>
-          <w:lang w:val="sv-SE"/>
-        </w:rPr>
-        <w:t>PIHAK PERTAMA</w:t>
-      </w:r>
-      <w:r>
-        <w:rPr>
-          <w:rFonts w:ascii="Bookman Old Style" w:hAnsi="Bookman Old Style"/>
-          <w:color w:val="000000" w:themeColor="text1"/>
-          <w:sz w:val="24"/>
-          <w:szCs w:val="24"/>
-          <w:lang w:val="sv-SE"/>
-        </w:rPr>
-        <w:t>.</w:t>
+        <w:t xml:space="preserve"> pada Badan Pusat Statistik Kabupaten Simeulue,</w:t>
       </w:r>
       <w:r>
         <w:rPr>
@@ -1338,270 +1467,7 @@
           <w:szCs w:val="24"/>
           <w:lang w:val="id-ID"/>
         </w:rPr>
-        <w:t xml:space="preserve"> </w:t>
-      </w:r>
-    </w:p>
-    <w:p>
-      <w:pPr>
-        <w:spacing w:line="276" w:lineRule="auto"/>
-        <w:jc w:val="both"/>
-        <w:rPr>
-          <w:rFonts w:ascii="Bookman Old Style" w:hAnsi="Bookman Old Style"/>
-          <w:b/>
-          <w:color w:val="000000" w:themeColor="text1"/>
-          <w:sz w:val="24"/>
-          <w:szCs w:val="24"/>
-          <w:lang w:val="id-ID"/>
-        </w:rPr>
-      </w:pPr>
-    </w:p>
-    <w:p>
-      <w:pPr>
-        <w:spacing w:after="120"/>
-        <w:jc w:val="center"/>
-        <w:rPr>
-          <w:rFonts w:ascii="Bookman Old Style" w:hAnsi="Bookman Old Style"/>
-          <w:b/>
-          <w:color w:val="000000" w:themeColor="text1"/>
-          <w:sz w:val="24"/>
-          <w:szCs w:val="24"/>
-          <w:lang w:val="id-ID"/>
-        </w:rPr>
-      </w:pPr>
-      <w:r>
-        <w:rPr>
-          <w:rFonts w:ascii="Bookman Old Style" w:hAnsi="Bookman Old Style"/>
-          <w:b/>
-          <w:color w:val="000000" w:themeColor="text1"/>
-          <w:sz w:val="24"/>
-          <w:szCs w:val="24"/>
-          <w:lang w:val="id-ID"/>
-        </w:rPr>
-        <w:t>Pasal 2</w:t>
-      </w:r>
-    </w:p>
-    <w:p>
-      <w:pPr>
-        <w:spacing w:line="276" w:lineRule="auto"/>
-        <w:jc w:val="both"/>
-        <w:rPr>
-          <w:rFonts w:ascii="Bookman Old Style" w:hAnsi="Bookman Old Style"/>
-          <w:color w:val="000000" w:themeColor="text1"/>
-          <w:sz w:val="24"/>
-          <w:szCs w:val="24"/>
-          <w:lang w:val="id-ID"/>
-        </w:rPr>
-      </w:pPr>
-      <w:r>
-        <w:rPr>
-          <w:rFonts w:ascii="Bookman Old Style" w:hAnsi="Bookman Old Style"/>
-          <w:color w:val="000000" w:themeColor="text1"/>
-          <w:sz w:val="24"/>
-          <w:szCs w:val="24"/>
-          <w:lang w:val="id-ID"/>
-        </w:rPr>
-        <w:t xml:space="preserve">Ruang lingkup pekerjaan dalam Perjanjian ini mengacu pada wilayah kerja dan beban kerja sebagaimana tertuang dalam lampiran Perjanjian. </w:t>
-      </w:r>
-      <w:r>
-        <w:rPr>
-          <w:rFonts w:ascii="Bookman Old Style" w:hAnsi="Bookman Old Style"/>
-          <w:color w:val="000000" w:themeColor="text1"/>
-          <w:sz w:val="24"/>
-          <w:szCs w:val="24"/>
-          <w:lang w:val="id-ID"/>
-        </w:rPr>
-        <w:t xml:space="preserve">Pedoman </w:t>
-      </w:r>
-      <w:proofErr w:type="spellStart"/>
-      <w:r>
-        <w:rPr>
-          <w:rFonts w:ascii="Bookman Old Style" w:hAnsi="Bookman Old Style"/>
-          <w:color w:val="000000" w:themeColor="text1"/>
-          <w:sz w:val="24"/>
-          <w:szCs w:val="24"/>
-        </w:rPr>
-        <w:t>Pengawasan</w:t>
-      </w:r>
-      <w:proofErr w:type="spellEnd"/>
-      <w:r>
-        <w:rPr>
-          <w:rFonts w:ascii="Bookman Old Style" w:hAnsi="Bookman Old Style"/>
-          <w:color w:val="000000" w:themeColor="text1"/>
-          <w:sz w:val="24"/>
-          <w:szCs w:val="24"/>
-        </w:rPr>
-        <w:t>/</w:t>
-      </w:r>
-      <w:r>
-        <w:rPr>
-          <w:rFonts w:ascii="Bookman Old Style" w:hAnsi="Bookman Old Style"/>
-          <w:bCs/>
-          <w:color w:val="000000" w:themeColor="text1"/>
-          <w:sz w:val="24"/>
-          <w:szCs w:val="24"/>
-          <w:lang w:val="id-ID"/>
-        </w:rPr>
-        <w:t>Pen</w:t>
-      </w:r>
-      <w:r>
-        <w:rPr>
-          <w:rFonts w:ascii="Bookman Old Style" w:hAnsi="Bookman Old Style"/>
-          <w:bCs/>
-          <w:noProof/>
-          <w:color w:val="000000" w:themeColor="text1"/>
-          <w:sz w:val="24"/>
-          <w:szCs w:val="24"/>
-          <w:lang w:val="id-ID"/>
-        </w:rPr>
-        <w:t>cacahan Kegiatan Lapangan Survei</w:t>
-      </w:r>
-      <w:r>
-        <w:rPr>
-          <w:rFonts w:ascii="Bookman Old Style" w:hAnsi="Bookman Old Style"/>
-          <w:bCs/>
-          <w:noProof/>
-          <w:color w:val="000000" w:themeColor="text1"/>
-          <w:sz w:val="24"/>
-          <w:szCs w:val="24"/>
-        </w:rPr>
-        <w:t xml:space="preserve"> </w:t>
-      </w:r>
-      <w:r>
-        <w:rPr>
-          <w:rFonts w:ascii="Bookman Old Style" w:hAnsi="Bookman Old Style"/>
-          <w:bCs/>
-          <w:noProof/>
-          <w:color w:val="000000" w:themeColor="text1"/>
-          <w:sz w:val="24"/>
-          <w:szCs w:val="24"/>
-          <w:lang w:val="id-ID"/>
-        </w:rPr>
-        <w:t xml:space="preserve">Bulan </w:t>
-      </w:r>
-      <w:r>
-        <w:rPr>
-          <w:rFonts w:ascii="Bookman Old Style" w:hAnsi="Bookman Old Style"/>
-          <w:bCs/>
-          <w:noProof/>
-          <w:color w:val="000000" w:themeColor="text1"/>
-          <w:sz w:val="24"/>
-          <w:szCs w:val="24"/>
-          <w:highlight w:val="yellow"/>
-          <w:lang w:val="sv-SE"/>
-        </w:rPr>
-        <w:t>${</w:t>
-      </w:r>
-      <w:r>
-        <w:rPr>
-          <w:rFonts w:ascii="Bookman Old Style" w:hAnsi="Bookman Old Style"/>
-          <w:bCs/>
-          <w:noProof/>
-          <w:color w:val="000000" w:themeColor="text1"/>
-          <w:sz w:val="24"/>
-          <w:szCs w:val="24"/>
-          <w:highlight w:val="yellow"/>
-          <w:lang w:val="sv-SE"/>
-        </w:rPr>
-        <w:t>Bulan</w:t>
-      </w:r>
-      <w:r>
-        <w:rPr>
-          <w:rFonts w:ascii="Bookman Old Style" w:hAnsi="Bookman Old Style"/>
-          <w:bCs/>
-          <w:noProof/>
-          <w:color w:val="000000" w:themeColor="text1"/>
-          <w:sz w:val="24"/>
-          <w:szCs w:val="24"/>
-          <w:highlight w:val="yellow"/>
-          <w:lang w:val="sv-SE"/>
-        </w:rPr>
-        <w:t>}</w:t>
-      </w:r>
-      <w:r>
-        <w:rPr>
-          <w:rFonts w:ascii="Bookman Old Style" w:hAnsi="Bookman Old Style"/>
-          <w:bCs/>
-          <w:noProof/>
-          <w:color w:val="000000" w:themeColor="text1"/>
-          <w:sz w:val="24"/>
-          <w:szCs w:val="24"/>
-          <w:lang w:val="sv-SE"/>
-        </w:rPr>
-        <w:t xml:space="preserve"> </w:t>
-      </w:r>
-      <w:r>
-        <w:rPr>
-          <w:rFonts w:ascii="Bookman Old Style" w:hAnsi="Bookman Old Style"/>
-          <w:bCs/>
-          <w:color w:val="000000" w:themeColor="text1"/>
-          <w:sz w:val="24"/>
-          <w:szCs w:val="24"/>
-          <w:lang w:val="id-ID"/>
-        </w:rPr>
-        <w:t>Tahun 202</w:t>
-      </w:r>
-      <w:r>
-        <w:rPr>
-          <w:rFonts w:ascii="Bookman Old Style" w:hAnsi="Bookman Old Style"/>
-          <w:bCs/>
-          <w:color w:val="000000" w:themeColor="text1"/>
-          <w:sz w:val="24"/>
-          <w:szCs w:val="24"/>
-        </w:rPr>
-        <w:t>5</w:t>
-      </w:r>
-      <w:r>
-        <w:rPr>
-          <w:rFonts w:ascii="Bookman Old Style" w:hAnsi="Bookman Old Style"/>
-          <w:bCs/>
-          <w:color w:val="000000" w:themeColor="text1"/>
-          <w:sz w:val="24"/>
-          <w:szCs w:val="24"/>
-          <w:lang w:val="id-ID"/>
-        </w:rPr>
-        <w:t xml:space="preserve"> pada B</w:t>
-      </w:r>
-      <w:r>
-        <w:rPr>
-          <w:rFonts w:ascii="Bookman Old Style" w:hAnsi="Bookman Old Style"/>
-          <w:bCs/>
-          <w:color w:val="000000" w:themeColor="text1"/>
-          <w:sz w:val="24"/>
-          <w:szCs w:val="24"/>
-          <w:lang w:val="id-ID"/>
-        </w:rPr>
-        <w:t>adan Pusat Statistik</w:t>
-      </w:r>
-      <w:r>
-        <w:rPr>
-          <w:rFonts w:ascii="Bookman Old Style" w:hAnsi="Bookman Old Style"/>
-          <w:bCs/>
-          <w:color w:val="000000" w:themeColor="text1"/>
-          <w:sz w:val="24"/>
-          <w:szCs w:val="24"/>
-          <w:lang w:val="id-ID"/>
-        </w:rPr>
-        <w:t xml:space="preserve"> Kabupaten Simeulue,</w:t>
-      </w:r>
-      <w:r>
-        <w:rPr>
-          <w:rFonts w:ascii="Bookman Old Style" w:hAnsi="Bookman Old Style"/>
-          <w:color w:val="000000" w:themeColor="text1"/>
-          <w:sz w:val="24"/>
-          <w:szCs w:val="24"/>
-          <w:lang w:val="id-ID"/>
-        </w:rPr>
-        <w:t xml:space="preserve"> </w:t>
-      </w:r>
-      <w:r>
-        <w:rPr>
-          <w:rFonts w:ascii="Bookman Old Style" w:hAnsi="Bookman Old Style"/>
-          <w:color w:val="000000" w:themeColor="text1"/>
-          <w:sz w:val="24"/>
-          <w:szCs w:val="24"/>
-          <w:lang w:val="id-ID"/>
-        </w:rPr>
-        <w:t xml:space="preserve">dan ketentuan-ketentuan yang ditetapkan oleh </w:t>
+        <w:t xml:space="preserve"> dan ketentuan-ketentuan yang ditetapkan oleh </w:t>
       </w:r>
       <w:r>
         <w:rPr>
@@ -1741,10 +1607,9 @@
           <w:color w:val="000000" w:themeColor="text1"/>
           <w:sz w:val="24"/>
           <w:szCs w:val="24"/>
-          <w:highlight w:val="yellow"/>
-          <w:lang w:val="sv-SE"/>
-        </w:rPr>
-        <w:t>${</w:t>
+          <w:lang w:val="sv-SE"/>
+        </w:rPr>
+        <w:t>${tgl_awal}</w:t>
       </w:r>
       <w:r>
         <w:rPr>
@@ -1753,10 +1618,9 @@
           <w:color w:val="000000" w:themeColor="text1"/>
           <w:sz w:val="24"/>
           <w:szCs w:val="24"/>
-          <w:highlight w:val="yellow"/>
-          <w:lang w:val="sv-SE"/>
-        </w:rPr>
-        <w:t>tgl_awal</w:t>
+          <w:lang w:val="sv-SE"/>
+        </w:rPr>
+        <w:t xml:space="preserve"> 202</w:t>
       </w:r>
       <w:r>
         <w:rPr>
@@ -1765,10 +1629,19 @@
           <w:color w:val="000000" w:themeColor="text1"/>
           <w:sz w:val="24"/>
           <w:szCs w:val="24"/>
-          <w:highlight w:val="yellow"/>
-          <w:lang w:val="sv-SE"/>
-        </w:rPr>
-        <w:t>}</w:t>
+          <w:lang w:val="sv-SE"/>
+        </w:rPr>
+        <w:t>5</w:t>
+      </w:r>
+      <w:r>
+        <w:rPr>
+          <w:rFonts w:ascii="Bookman Old Style" w:eastAsia="Bookman Old Style" w:hAnsi="Bookman Old Style" w:cs="Bookman Old Style"/>
+          <w:color w:val="000000" w:themeColor="text1"/>
+          <w:sz w:val="24"/>
+          <w:szCs w:val="24"/>
+          <w:lang w:val="sv-SE"/>
+        </w:rPr>
+        <w:t xml:space="preserve"> sampai dengan tanggal </w:t>
       </w:r>
       <w:r>
         <w:rPr>
@@ -1779,7 +1652,7 @@
           <w:szCs w:val="24"/>
           <w:lang w:val="sv-SE"/>
         </w:rPr>
-        <w:t xml:space="preserve"> 202</w:t>
+        <w:t>${tgl_akhir}</w:t>
       </w:r>
       <w:r>
         <w:rPr>
@@ -1790,17 +1663,7 @@
           <w:szCs w:val="24"/>
           <w:lang w:val="sv-SE"/>
         </w:rPr>
-        <w:t>5</w:t>
-      </w:r>
-      <w:r>
-        <w:rPr>
-          <w:rFonts w:ascii="Bookman Old Style" w:eastAsia="Bookman Old Style" w:hAnsi="Bookman Old Style" w:cs="Bookman Old Style"/>
-          <w:color w:val="000000" w:themeColor="text1"/>
-          <w:sz w:val="24"/>
-          <w:szCs w:val="24"/>
-          <w:lang w:val="sv-SE"/>
-        </w:rPr>
-        <w:t xml:space="preserve"> sampai dengan tanggal </w:t>
+        <w:t xml:space="preserve"> 202</w:t>
       </w:r>
       <w:r>
         <w:rPr>
@@ -1809,53 +1672,6 @@
           <w:color w:val="000000" w:themeColor="text1"/>
           <w:sz w:val="24"/>
           <w:szCs w:val="24"/>
-          <w:highlight w:val="yellow"/>
-          <w:lang w:val="sv-SE"/>
-        </w:rPr>
-        <w:t>${</w:t>
-      </w:r>
-      <w:r>
-        <w:rPr>
-          <w:rFonts w:ascii="Bookman Old Style" w:eastAsia="Bookman Old Style" w:hAnsi="Bookman Old Style" w:cs="Bookman Old Style"/>
-          <w:noProof/>
-          <w:color w:val="000000" w:themeColor="text1"/>
-          <w:sz w:val="24"/>
-          <w:szCs w:val="24"/>
-          <w:highlight w:val="yellow"/>
-          <w:lang w:val="sv-SE"/>
-        </w:rPr>
-        <w:t>tgl_akhir</w:t>
-      </w:r>
-      <w:r>
-        <w:rPr>
-          <w:rFonts w:ascii="Bookman Old Style" w:eastAsia="Bookman Old Style" w:hAnsi="Bookman Old Style" w:cs="Bookman Old Style"/>
-          <w:noProof/>
-          <w:color w:val="000000" w:themeColor="text1"/>
-          <w:sz w:val="24"/>
-          <w:szCs w:val="24"/>
-          <w:highlight w:val="yellow"/>
-          <w:lang w:val="sv-SE"/>
-        </w:rPr>
-        <w:t>}</w:t>
-      </w:r>
-      <w:r>
-        <w:rPr>
-          <w:rFonts w:ascii="Bookman Old Style" w:eastAsia="Bookman Old Style" w:hAnsi="Bookman Old Style" w:cs="Bookman Old Style"/>
-          <w:noProof/>
-          <w:color w:val="000000" w:themeColor="text1"/>
-          <w:sz w:val="24"/>
-          <w:szCs w:val="24"/>
-          <w:lang w:val="sv-SE"/>
-        </w:rPr>
-        <w:t xml:space="preserve"> 202</w:t>
-      </w:r>
-      <w:r>
-        <w:rPr>
-          <w:rFonts w:ascii="Bookman Old Style" w:eastAsia="Bookman Old Style" w:hAnsi="Bookman Old Style" w:cs="Bookman Old Style"/>
-          <w:noProof/>
-          <w:color w:val="000000" w:themeColor="text1"/>
-          <w:sz w:val="24"/>
-          <w:szCs w:val="24"/>
           <w:lang w:val="sv-SE"/>
         </w:rPr>
         <w:t>5</w:t>
@@ -2003,17 +1819,7 @@
           <w:szCs w:val="24"/>
           <w:lang w:val="sv-SE"/>
         </w:rPr>
-        <w:t xml:space="preserve"> </w:t>
-      </w:r>
-      <w:r>
-        <w:rPr>
-          <w:rFonts w:ascii="Bookman Old Style" w:hAnsi="Bookman Old Style"/>
-          <w:color w:val="000000" w:themeColor="text1"/>
-          <w:sz w:val="24"/>
-          <w:szCs w:val="24"/>
-          <w:lang w:val="sv-SE"/>
-        </w:rPr>
-        <w:t xml:space="preserve">pencegahan </w:t>
+        <w:t xml:space="preserve"> pencegahan </w:t>
       </w:r>
       <w:r>
         <w:rPr>
@@ -2290,7 +2096,6 @@
           <w:color w:val="000000" w:themeColor="text1"/>
           <w:sz w:val="24"/>
           <w:szCs w:val="24"/>
-          <w:highlight w:val="yellow"/>
           <w:lang w:val="sv-SE"/>
         </w:rPr>
         <w:t>${</w:t>
@@ -2301,7 +2106,6 @@
           <w:color w:val="000000" w:themeColor="text1"/>
           <w:sz w:val="24"/>
           <w:szCs w:val="24"/>
-          <w:highlight w:val="yellow"/>
           <w:lang w:val="sv-SE"/>
         </w:rPr>
         <w:t>total_</w:t>
@@ -2312,21 +2116,9 @@
           <w:color w:val="000000" w:themeColor="text1"/>
           <w:sz w:val="24"/>
           <w:szCs w:val="24"/>
-          <w:highlight w:val="yellow"/>
-          <w:lang w:val="sv-SE"/>
-        </w:rPr>
-        <w:t>honor</w:t>
-      </w:r>
-      <w:r>
-        <w:rPr>
-          <w:rFonts w:ascii="Bookman Old Style" w:hAnsi="Bookman Old Style"/>
-          <w:color w:val="000000" w:themeColor="text1"/>
-          <w:sz w:val="24"/>
-          <w:szCs w:val="24"/>
-          <w:highlight w:val="yellow"/>
-          <w:lang w:val="sv-SE"/>
-        </w:rPr>
-        <w:t>}</w:t>
+          <w:lang w:val="sv-SE"/>
+        </w:rPr>
+        <w:t>honor}</w:t>
       </w:r>
       <w:r>
         <w:rPr>
@@ -2353,7 +2145,6 @@
           <w:color w:val="000000" w:themeColor="text1"/>
           <w:sz w:val="24"/>
           <w:szCs w:val="24"/>
-          <w:highlight w:val="yellow"/>
           <w:lang w:val="sv-SE"/>
         </w:rPr>
         <w:t>${</w:t>
@@ -2365,7 +2156,6 @@
           <w:color w:val="000000" w:themeColor="text1"/>
           <w:sz w:val="24"/>
           <w:szCs w:val="24"/>
-          <w:highlight w:val="yellow"/>
           <w:lang w:val="sv-SE"/>
         </w:rPr>
         <w:t>total_</w:t>
@@ -2377,7 +2167,6 @@
           <w:color w:val="000000" w:themeColor="text1"/>
           <w:sz w:val="24"/>
           <w:szCs w:val="24"/>
-          <w:highlight w:val="yellow"/>
           <w:lang w:val="sv-SE"/>
         </w:rPr>
         <w:t>honor_terbilang</w:t>
@@ -2389,7 +2178,6 @@
           <w:color w:val="000000" w:themeColor="text1"/>
           <w:sz w:val="24"/>
           <w:szCs w:val="24"/>
-          <w:highlight w:val="yellow"/>
           <w:lang w:val="sv-SE"/>
         </w:rPr>
         <w:t>_kecil</w:t>
@@ -2401,7 +2189,6 @@
           <w:color w:val="000000" w:themeColor="text1"/>
           <w:sz w:val="24"/>
           <w:szCs w:val="24"/>
-          <w:highlight w:val="yellow"/>
           <w:lang w:val="sv-SE"/>
         </w:rPr>
         <w:t>}</w:t>
@@ -3343,37 +3130,7 @@
           <w:szCs w:val="24"/>
           <w:lang w:val="id-ID"/>
         </w:rPr>
-        <w:t xml:space="preserve"> tidak dapat melaksanakan kewajibannya sebagaimana dimaksud dalam </w:t>
-      </w:r>
-      <w:r>
-        <w:rPr>
-          <w:rFonts w:ascii="Bookman Old Style" w:hAnsi="Bookman Old Style"/>
-          <w:color w:val="000000" w:themeColor="text1"/>
-          <w:sz w:val="24"/>
-          <w:szCs w:val="24"/>
-          <w:lang w:val="id-ID"/>
-        </w:rPr>
-        <w:t>P</w:t>
-      </w:r>
-      <w:r>
-        <w:rPr>
-          <w:rFonts w:ascii="Bookman Old Style" w:hAnsi="Bookman Old Style"/>
-          <w:color w:val="000000" w:themeColor="text1"/>
-          <w:sz w:val="24"/>
-          <w:szCs w:val="24"/>
-          <w:lang w:val="id-ID"/>
-        </w:rPr>
-        <w:t xml:space="preserve">asal 4, termasuk dalam </w:t>
-      </w:r>
-      <w:r>
-        <w:rPr>
-          <w:rFonts w:ascii="Bookman Old Style" w:hAnsi="Bookman Old Style"/>
-          <w:color w:val="000000" w:themeColor="text1"/>
-          <w:sz w:val="24"/>
-          <w:szCs w:val="24"/>
-          <w:lang w:val="id-ID"/>
-        </w:rPr>
-        <w:t xml:space="preserve">kondisi terindikasi terinfeksi virus </w:t>
+        <w:t xml:space="preserve"> tidak dapat melaksanakan kewajibannya sebagaimana dimaksud dalam Pasal 4, termasuk dalam kondisi terindikasi terinfeksi virus </w:t>
       </w:r>
       <w:r>
         <w:rPr>
@@ -3605,16 +3362,7 @@
           <w:sz w:val="24"/>
           <w:szCs w:val="24"/>
         </w:rPr>
-        <w:t xml:space="preserve"> meninggal dunia, mengundurkan diri karena sakit dengan keterangan rawat inap, </w:t>
-      </w:r>
-      <w:r>
-        <w:rPr>
-          <w:rFonts w:ascii="Bookman Old Style" w:hAnsi="Bookman Old Style"/>
-          <w:color w:val="000000" w:themeColor="text1"/>
-          <w:sz w:val="24"/>
-          <w:szCs w:val="24"/>
-        </w:rPr>
-        <w:t xml:space="preserve">terindikasi terinfeksi virus </w:t>
+        <w:t xml:space="preserve"> meninggal dunia, mengundurkan diri karena sakit dengan keterangan rawat inap, terindikasi terinfeksi virus </w:t>
       </w:r>
       <w:r>
         <w:rPr>
@@ -4437,34 +4185,9 @@
                 <w:color w:val="000000" w:themeColor="text1"/>
                 <w:sz w:val="24"/>
                 <w:szCs w:val="24"/>
-                <w:highlight w:val="yellow"/>
                 <w:lang w:val="sv-SE"/>
               </w:rPr>
-              <w:t>${</w:t>
-            </w:r>
-            <w:r>
-              <w:rPr>
-                <w:rFonts w:ascii="Bookman Old Style" w:hAnsi="Bookman Old Style"/>
-                <w:noProof/>
-                <w:color w:val="000000" w:themeColor="text1"/>
-                <w:sz w:val="24"/>
-                <w:szCs w:val="24"/>
-                <w:highlight w:val="yellow"/>
-                <w:lang w:val="sv-SE"/>
-              </w:rPr>
-              <w:t>nama_mitra</w:t>
-            </w:r>
-            <w:r>
-              <w:rPr>
-                <w:rFonts w:ascii="Bookman Old Style" w:hAnsi="Bookman Old Style"/>
-                <w:noProof/>
-                <w:color w:val="000000" w:themeColor="text1"/>
-                <w:sz w:val="24"/>
-                <w:szCs w:val="24"/>
-                <w:highlight w:val="yellow"/>
-                <w:lang w:val="sv-SE"/>
-              </w:rPr>
-              <w:t>}</w:t>
+              <w:t>${nama_mitra}</w:t>
             </w:r>
           </w:p>
         </w:tc>
@@ -4709,13 +4432,7 @@
         <w:rPr>
           <w:rFonts w:ascii="Bookman Old Style" w:hAnsi="Bookman Old Style"/>
         </w:rPr>
-        <w:t>PERJANJIAN KERJA PETUGAS PENCACAHAN</w:t>
-      </w:r>
-      <w:r>
-        <w:rPr>
-          <w:rFonts w:ascii="Bookman Old Style" w:hAnsi="Bookman Old Style"/>
-        </w:rPr>
-        <w:t xml:space="preserve"> KEGIATAN LAPANGAN</w:t>
+        <w:t>PERJANJIAN KERJA PETUGAS PENCACAHAN KEGIATAN LAPANGAN</w:t>
       </w:r>
     </w:p>
     <w:p>
@@ -4753,33 +4470,9 @@
       <w:r>
         <w:rPr>
           <w:rFonts w:ascii="Bookman Old Style" w:hAnsi="Bookman Old Style"/>
-          <w:highlight w:val="yellow"/>
-          <w:lang w:val="sv-SE"/>
-        </w:rPr>
-        <w:t>${</w:t>
-      </w:r>
-      <w:r>
-        <w:rPr>
-          <w:rFonts w:ascii="Bookman Old Style" w:hAnsi="Bookman Old Style"/>
-          <w:highlight w:val="yellow"/>
-          <w:lang w:val="sv-SE"/>
-        </w:rPr>
-        <w:t>BULAN</w:t>
-      </w:r>
-      <w:r>
-        <w:rPr>
-          <w:rFonts w:ascii="Bookman Old Style" w:hAnsi="Bookman Old Style"/>
-          <w:highlight w:val="yellow"/>
-          <w:lang w:val="sv-SE"/>
-        </w:rPr>
-        <w:t>}</w:t>
-      </w:r>
-      <w:r>
-        <w:rPr>
-          <w:rFonts w:ascii="Bookman Old Style" w:hAnsi="Bookman Old Style"/>
-          <w:lang w:val="sv-SE"/>
-        </w:rPr>
-        <w:t xml:space="preserve"> </w:t>
+          <w:lang w:val="sv-SE"/>
+        </w:rPr>
+        <w:t xml:space="preserve">${BULAN} </w:t>
       </w:r>
       <w:r>
         <w:rPr>
@@ -4856,26 +4549,9 @@
       <w:r>
         <w:rPr>
           <w:rFonts w:ascii="Bookman Old Style" w:hAnsi="Bookman Old Style"/>
-          <w:highlight w:val="yellow"/>
-          <w:lang w:val="sv-SE"/>
-        </w:rPr>
-        <w:t>${</w:t>
-      </w:r>
-      <w:r>
-        <w:rPr>
-          <w:rFonts w:ascii="Bookman Old Style" w:hAnsi="Bookman Old Style"/>
-          <w:highlight w:val="yellow"/>
-          <w:lang w:val="sv-SE"/>
-        </w:rPr>
-        <w:t>nomor</w:t>
-      </w:r>
-      <w:r>
-        <w:rPr>
-          <w:rFonts w:ascii="Bookman Old Style" w:hAnsi="Bookman Old Style"/>
-          <w:highlight w:val="yellow"/>
-          <w:lang w:val="sv-SE"/>
-        </w:rPr>
-        <w:t>}</w:t>
+          <w:lang w:val="sv-SE"/>
+        </w:rPr>
+        <w:t>${nomor}</w:t>
       </w:r>
       <w:r>
         <w:rPr>
@@ -5418,26 +5094,9 @@
             <w:r>
               <w:rPr>
                 <w:rFonts w:ascii="Bookman Old Style" w:hAnsi="Bookman Old Style"/>
-                <w:highlight w:val="yellow"/>
                 <w:lang w:val="sv-SE"/>
               </w:rPr>
-              <w:t>${</w:t>
-            </w:r>
-            <w:r>
-              <w:rPr>
-                <w:rFonts w:ascii="Bookman Old Style" w:hAnsi="Bookman Old Style"/>
-                <w:highlight w:val="yellow"/>
-                <w:lang w:val="sv-SE"/>
-              </w:rPr>
-              <w:t>no_keg</w:t>
-            </w:r>
-            <w:r>
-              <w:rPr>
-                <w:rFonts w:ascii="Bookman Old Style" w:hAnsi="Bookman Old Style"/>
-                <w:highlight w:val="yellow"/>
-                <w:lang w:val="sv-SE"/>
-              </w:rPr>
-              <w:t>}</w:t>
+              <w:t>${no_keg}</w:t>
             </w:r>
           </w:p>
         </w:tc>
@@ -5455,26 +5114,9 @@
             <w:r>
               <w:rPr>
                 <w:rFonts w:ascii="Bookman Old Style" w:hAnsi="Bookman Old Style"/>
-                <w:highlight w:val="yellow"/>
                 <w:lang w:val="sv-SE"/>
               </w:rPr>
-              <w:t>${</w:t>
-            </w:r>
-            <w:r>
-              <w:rPr>
-                <w:rFonts w:ascii="Bookman Old Style" w:hAnsi="Bookman Old Style"/>
-                <w:highlight w:val="yellow"/>
-                <w:lang w:val="sv-SE"/>
-              </w:rPr>
-              <w:t>nama_keg</w:t>
-            </w:r>
-            <w:r>
-              <w:rPr>
-                <w:rFonts w:ascii="Bookman Old Style" w:hAnsi="Bookman Old Style"/>
-                <w:highlight w:val="yellow"/>
-                <w:lang w:val="sv-SE"/>
-              </w:rPr>
-              <w:t>}</w:t>
+              <w:t>${nama_keg}</w:t>
             </w:r>
           </w:p>
         </w:tc>
@@ -5492,26 +5134,9 @@
             <w:r>
               <w:rPr>
                 <w:rFonts w:ascii="Bookman Old Style" w:hAnsi="Bookman Old Style"/>
-                <w:highlight w:val="yellow"/>
                 <w:lang w:val="sv-SE"/>
               </w:rPr>
-              <w:t>${</w:t>
-            </w:r>
-            <w:r>
-              <w:rPr>
-                <w:rFonts w:ascii="Bookman Old Style" w:hAnsi="Bookman Old Style"/>
-                <w:highlight w:val="yellow"/>
-                <w:lang w:val="sv-SE"/>
-              </w:rPr>
-              <w:t>jkw</w:t>
-            </w:r>
-            <w:r>
-              <w:rPr>
-                <w:rFonts w:ascii="Bookman Old Style" w:hAnsi="Bookman Old Style"/>
-                <w:highlight w:val="yellow"/>
-                <w:lang w:val="sv-SE"/>
-              </w:rPr>
-              <w:t>}</w:t>
+              <w:t>${jkw}</w:t>
             </w:r>
           </w:p>
         </w:tc>
@@ -5526,32 +5151,14 @@
               <w:jc w:val="center"/>
               <w:rPr>
                 <w:rFonts w:ascii="Bookman Old Style" w:hAnsi="Bookman Old Style"/>
-                <w:highlight w:val="yellow"/>
               </w:rPr>
             </w:pPr>
             <w:r>
               <w:rPr>
                 <w:rFonts w:ascii="Bookman Old Style" w:hAnsi="Bookman Old Style"/>
-                <w:highlight w:val="yellow"/>
                 <w:lang w:val="sv-SE"/>
               </w:rPr>
-              <w:t>${</w:t>
-            </w:r>
-            <w:r>
-              <w:rPr>
-                <w:rFonts w:ascii="Bookman Old Style" w:hAnsi="Bookman Old Style"/>
-                <w:highlight w:val="yellow"/>
-                <w:lang w:val="sv-SE"/>
-              </w:rPr>
-              <w:t>vol_keg</w:t>
-            </w:r>
-            <w:r>
-              <w:rPr>
-                <w:rFonts w:ascii="Bookman Old Style" w:hAnsi="Bookman Old Style"/>
-                <w:highlight w:val="yellow"/>
-                <w:lang w:val="sv-SE"/>
-              </w:rPr>
-              <w:t>}</w:t>
+              <w:t>${vol_keg}</w:t>
             </w:r>
           </w:p>
         </w:tc>
@@ -5566,32 +5173,14 @@
               <w:jc w:val="center"/>
               <w:rPr>
                 <w:rFonts w:ascii="Bookman Old Style" w:hAnsi="Bookman Old Style"/>
-                <w:highlight w:val="yellow"/>
               </w:rPr>
             </w:pPr>
             <w:r>
               <w:rPr>
                 <w:rFonts w:ascii="Bookman Old Style" w:hAnsi="Bookman Old Style"/>
-                <w:highlight w:val="yellow"/>
                 <w:lang w:val="sv-SE"/>
               </w:rPr>
-              <w:t>${</w:t>
-            </w:r>
-            <w:r>
-              <w:rPr>
-                <w:rFonts w:ascii="Bookman Old Style" w:hAnsi="Bookman Old Style"/>
-                <w:highlight w:val="yellow"/>
-                <w:lang w:val="sv-SE"/>
-              </w:rPr>
-              <w:t>sat_keg</w:t>
-            </w:r>
-            <w:r>
-              <w:rPr>
-                <w:rFonts w:ascii="Bookman Old Style" w:hAnsi="Bookman Old Style"/>
-                <w:highlight w:val="yellow"/>
-                <w:lang w:val="sv-SE"/>
-              </w:rPr>
-              <w:t>}</w:t>
+              <w:t>${sat_keg}</w:t>
             </w:r>
           </w:p>
         </w:tc>
@@ -5606,32 +5195,14 @@
               <w:jc w:val="center"/>
               <w:rPr>
                 <w:rFonts w:ascii="Bookman Old Style" w:hAnsi="Bookman Old Style"/>
-                <w:highlight w:val="yellow"/>
               </w:rPr>
             </w:pPr>
             <w:r>
               <w:rPr>
                 <w:rFonts w:ascii="Bookman Old Style" w:hAnsi="Bookman Old Style"/>
-                <w:highlight w:val="yellow"/>
                 <w:lang w:val="sv-SE"/>
               </w:rPr>
-              <w:t>${</w:t>
-            </w:r>
-            <w:r>
-              <w:rPr>
-                <w:rFonts w:ascii="Bookman Old Style" w:hAnsi="Bookman Old Style"/>
-                <w:highlight w:val="yellow"/>
-                <w:lang w:val="sv-SE"/>
-              </w:rPr>
-              <w:t>harga_sat</w:t>
-            </w:r>
-            <w:r>
-              <w:rPr>
-                <w:rFonts w:ascii="Bookman Old Style" w:hAnsi="Bookman Old Style"/>
-                <w:highlight w:val="yellow"/>
-                <w:lang w:val="sv-SE"/>
-              </w:rPr>
-              <w:t>}</w:t>
+              <w:t>${harga_sat}</w:t>
             </w:r>
           </w:p>
         </w:tc>
@@ -5646,32 +5217,14 @@
               <w:jc w:val="center"/>
               <w:rPr>
                 <w:rFonts w:ascii="Bookman Old Style" w:hAnsi="Bookman Old Style"/>
-                <w:highlight w:val="yellow"/>
               </w:rPr>
             </w:pPr>
             <w:r>
               <w:rPr>
                 <w:rFonts w:ascii="Bookman Old Style" w:hAnsi="Bookman Old Style"/>
-                <w:highlight w:val="yellow"/>
                 <w:lang w:val="sv-SE"/>
               </w:rPr>
-              <w:t>${</w:t>
-            </w:r>
-            <w:r>
-              <w:rPr>
-                <w:rFonts w:ascii="Bookman Old Style" w:hAnsi="Bookman Old Style"/>
-                <w:highlight w:val="yellow"/>
-                <w:lang w:val="sv-SE"/>
-              </w:rPr>
-              <w:t>honor</w:t>
-            </w:r>
-            <w:r>
-              <w:rPr>
-                <w:rFonts w:ascii="Bookman Old Style" w:hAnsi="Bookman Old Style"/>
-                <w:highlight w:val="yellow"/>
-                <w:lang w:val="sv-SE"/>
-              </w:rPr>
-              <w:t>}</w:t>
+              <w:t>${honor}</w:t>
             </w:r>
           </w:p>
         </w:tc>
@@ -5686,32 +5239,14 @@
               <w:jc w:val="center"/>
               <w:rPr>
                 <w:rFonts w:ascii="Bookman Old Style" w:hAnsi="Bookman Old Style"/>
-                <w:highlight w:val="yellow"/>
               </w:rPr>
             </w:pPr>
             <w:r>
               <w:rPr>
                 <w:rFonts w:ascii="Bookman Old Style" w:hAnsi="Bookman Old Style"/>
-                <w:highlight w:val="yellow"/>
                 <w:lang w:val="sv-SE"/>
               </w:rPr>
-              <w:t>${</w:t>
-            </w:r>
-            <w:r>
-              <w:rPr>
-                <w:rFonts w:ascii="Bookman Old Style" w:hAnsi="Bookman Old Style"/>
-                <w:highlight w:val="yellow"/>
-                <w:lang w:val="sv-SE"/>
-              </w:rPr>
-              <w:t>beban_ang</w:t>
-            </w:r>
-            <w:r>
-              <w:rPr>
-                <w:rFonts w:ascii="Bookman Old Style" w:hAnsi="Bookman Old Style"/>
-                <w:highlight w:val="yellow"/>
-                <w:lang w:val="sv-SE"/>
-              </w:rPr>
-              <w:t>}</w:t>
+              <w:t>${beban_ang}</w:t>
             </w:r>
           </w:p>
         </w:tc>
@@ -5751,28 +5286,9 @@
               <w:rPr>
                 <w:rFonts w:ascii="Bookman Old Style" w:hAnsi="Bookman Old Style"/>
                 <w:i/>
-                <w:highlight w:val="yellow"/>
                 <w:lang w:val="sv-SE"/>
               </w:rPr>
-              <w:t>${</w:t>
-            </w:r>
-            <w:r>
-              <w:rPr>
-                <w:rFonts w:ascii="Bookman Old Style" w:hAnsi="Bookman Old Style"/>
-                <w:i/>
-                <w:highlight w:val="yellow"/>
-                <w:lang w:val="sv-SE"/>
-              </w:rPr>
-              <w:t>total_honor_terbilang</w:t>
-            </w:r>
-            <w:r>
-              <w:rPr>
-                <w:rFonts w:ascii="Bookman Old Style" w:hAnsi="Bookman Old Style"/>
-                <w:i/>
-                <w:highlight w:val="yellow"/>
-                <w:lang w:val="sv-SE"/>
-              </w:rPr>
-              <w:t>}</w:t>
+              <w:t>${total_honor_terbilang}</w:t>
             </w:r>
           </w:p>
         </w:tc>
@@ -5790,26 +5306,9 @@
             <w:r>
               <w:rPr>
                 <w:rFonts w:ascii="Bookman Old Style" w:hAnsi="Bookman Old Style"/>
-                <w:highlight w:val="yellow"/>
                 <w:lang w:val="sv-SE"/>
               </w:rPr>
-              <w:t>${</w:t>
-            </w:r>
-            <w:r>
-              <w:rPr>
-                <w:rFonts w:ascii="Bookman Old Style" w:hAnsi="Bookman Old Style"/>
-                <w:highlight w:val="yellow"/>
-                <w:lang w:val="sv-SE"/>
-              </w:rPr>
-              <w:t>total_honor</w:t>
-            </w:r>
-            <w:r>
-              <w:rPr>
-                <w:rFonts w:ascii="Bookman Old Style" w:hAnsi="Bookman Old Style"/>
-                <w:highlight w:val="yellow"/>
-                <w:lang w:val="sv-SE"/>
-              </w:rPr>
-              <w:t>}</w:t>
+              <w:t>${total_honor}</w:t>
             </w:r>
           </w:p>
         </w:tc>

</xml_diff>

<commit_message>
ubah nama PPK di BAST, KAK, dan SPK
</commit_message>
<xml_diff>
--- a/public/SPK.docx
+++ b/public/SPK.docx
@@ -488,7 +488,7 @@
           <w:szCs w:val="24"/>
           <w:lang w:val="sv-SE"/>
         </w:rPr>
-        <w:t>Widya Khairani, SST</w:t>
+        <w:t>${nama_ppk}</w:t>
       </w:r>
       <w:r>
         <w:rPr>
@@ -4299,7 +4299,7 @@
                 <w:sz w:val="24"/>
                 <w:szCs w:val="24"/>
               </w:rPr>
-              <w:t>Widya Khairani, SST</w:t>
+              <w:t>${nama_ppk}</w:t>
             </w:r>
           </w:p>
           <w:p>

</xml_diff>